<commit_message>
Admin login: default admin/admin → change to real email in Settings
Replace the first-run 'create account' screen with the flow the client asked
for:
- Ships with default login admin/admin (server/auth/local.js falls back to it).
- A new 'Settings' pill opens an account panel where the admin sets their real
  company (Microsoft) email as the username + their own password (POST
  /api/admin/account, requireAdmin). Default stops working once changed.
- Login screen shows a 'first time? admin/admin' hint; dashboard shows a warning
  banner until the default is replaced (/api/admin/session returns usingDefault).
- Updated START-HERE.txt, the Word setup guide, and README to the new flow.
- Rebuilt static demo.

Co-Authored-By: Claude Opus 4.8 (1M context) <noreply@anthropic.com>
</commit_message>
<xml_diff>
--- a/Survey App - Setup Guide (Windows).docx
+++ b/Survey App - Setup Guide (Windows).docx
@@ -303,7 +303,7 @@
         <w:pStyle w:val="Heading1"/>
       </w:pPr>
       <w:r>
-        <w:t xml:space="preserve">Step 3 — Create your login (first time only)</w:t>
+        <w:t xml:space="preserve">Step 3 — Sign in and set your own login (first time only)</w:t>
       </w:r>
     </w:p>
     <w:p>
@@ -311,7 +311,34 @@
         <w:spacing w:after="120"/>
       </w:pPr>
       <w:r>
-        <w:t xml:space="preserve">The dashboard asks you to set up your admin login. This is just for you.</w:t>
+        <w:rPr>
+          <w:b/>
+          <w:bCs/>
+        </w:rPr>
+        <w:t xml:space="preserve">The first time only, sign in with the default login: </w:t>
+      </w:r>
+      <w:r>
+        <w:t xml:space="preserve">username </w:t>
+      </w:r>
+      <w:r>
+        <w:rPr>
+          <w:b/>
+          <w:bCs/>
+        </w:rPr>
+        <w:t xml:space="preserve">admin</w:t>
+      </w:r>
+      <w:r>
+        <w:t xml:space="preserve">  and password </w:t>
+      </w:r>
+      <w:r>
+        <w:rPr>
+          <w:b/>
+          <w:bCs/>
+        </w:rPr>
+        <w:t xml:space="preserve">admin</w:t>
+      </w:r>
+      <w:r>
+        <w:t xml:space="preserve">.</w:t>
       </w:r>
     </w:p>
     <w:p>
@@ -324,7 +351,7 @@
         <w:spacing w:after="80"/>
       </w:pPr>
       <w:r>
-        <w:t xml:space="preserve">Type your email.</w:t>
+        <w:t xml:space="preserve">Sign in with  admin  /  admin.</w:t>
       </w:r>
     </w:p>
     <w:p>
@@ -337,7 +364,7 @@
         <w:spacing w:after="80"/>
       </w:pPr>
       <w:r>
-        <w:t xml:space="preserve">Choose a password (at least 8 characters) and type it twice.</w:t>
+        <w:t xml:space="preserve">Click the "Settings" button at the top of the dashboard.</w:t>
       </w:r>
     </w:p>
     <w:p>
@@ -350,7 +377,7 @@
         <w:spacing w:after="80"/>
       </w:pPr>
       <w:r>
-        <w:t xml:space="preserve">Click "Create account &amp; sign in".</w:t>
+        <w:t xml:space="preserve">Type your real company (Microsoft) email and a password of your choice, then click Save.</w:t>
       </w:r>
     </w:p>
     <w:p>
@@ -363,7 +390,7 @@
           <w:iCs/>
           <w:color w:val="475569"/>
         </w:rPr>
-        <w:t xml:space="preserve">Next time you open the app, you simply sign in with the same email and password.</w:t>
+        <w:t xml:space="preserve">From now on you sign in with your own email and password. Use your company Microsoft email — it is the same address staff see when you send them the survey link.</w:t>
       </w:r>
     </w:p>
     <w:p>

</xml_diff>